<commit_message>
Bestenliste Overall als Reiter im GameOver
</commit_message>
<xml_diff>
--- a/weiter gehende Features.docx
+++ b/weiter gehende Features.docx
@@ -110,15 +110,7 @@
       </w:r>
       <w:r>
         <w:br/>
-        <w:t xml:space="preserve">→ leichtes </w:t>
-      </w:r>
-      <w:proofErr w:type="gramStart"/>
-      <w:r>
-        <w:t>Blinken</w:t>
-      </w:r>
-      <w:proofErr w:type="gramEnd"/>
-      <w:r>
-        <w:t xml:space="preserve"> wenn du nah an Score bist </w:t>
+        <w:t xml:space="preserve">→ leichtes Blinken wenn du nah an Score bist </w:t>
       </w:r>
     </w:p>
     <w:p>
@@ -224,6 +216,51 @@
         <w:t>Namen neu eingeben.</w:t>
       </w:r>
     </w:p>
+    <w:p/>
+    <w:p/>
+    <w:p>
+      <w:r>
+        <w:t>Aktueller Prompt:</w:t>
+      </w:r>
+    </w:p>
+    <w:p>
+      <w:r>
+        <w:t xml:space="preserve">Schwellenwerte: 3–4 × </w:t>
+      </w:r>
+      <w:r>
+        <w:rPr>
+          <w:rFonts w:ascii="Segoe UI Emoji" w:hAnsi="Segoe UI Emoji" w:cs="Segoe UI Emoji"/>
+        </w:rPr>
+        <w:t>🍀</w:t>
+      </w:r>
+      <w:r>
+        <w:t xml:space="preserve"> Glückspilz, 5–7 × </w:t>
+      </w:r>
+      <w:r>
+        <w:rPr>
+          <w:rFonts w:ascii="Segoe UI Emoji" w:hAnsi="Segoe UI Emoji" w:cs="Segoe UI Emoji"/>
+        </w:rPr>
+        <w:t>🔥</w:t>
+      </w:r>
+      <w:r>
+        <w:t xml:space="preserve"> Daredevil, 8–10 × </w:t>
+      </w:r>
+      <w:r>
+        <w:rPr>
+          <w:rFonts w:ascii="Segoe UI Emoji" w:hAnsi="Segoe UI Emoji" w:cs="Segoe UI Emoji"/>
+        </w:rPr>
+        <w:t>💀</w:t>
+      </w:r>
+      <w:r>
+        <w:t xml:space="preserve"> Lebensmüde, 11+ × die Zahlen sind zu gering. die Leute schaffen 40 Jumps.</w:t>
+      </w:r>
+    </w:p>
+    <w:p>
+      <w:r>
+        <w:t>Wird der Abstand auch gemessen, wenn man knapp hinter dem Objekt landet?</w:t>
+      </w:r>
+    </w:p>
+    <w:p/>
     <w:p/>
     <w:sectPr>
       <w:pgSz w:w="11906" w:h="16838"/>
@@ -1111,7 +1148,6 @@
   <w:style w:type="character" w:default="1" w:styleId="Absatz-Standardschriftart">
     <w:name w:val="Default Paragraph Font"/>
     <w:uiPriority w:val="1"/>
-    <w:semiHidden/>
     <w:unhideWhenUsed/>
   </w:style>
   <w:style w:type="table" w:default="1" w:styleId="NormaleTabelle">
@@ -1423,6 +1459,17 @@
       <w:smallCaps/>
       <w:color w:val="0F4761" w:themeColor="accent1" w:themeShade="BF"/>
       <w:spacing w:val="5"/>
+    </w:rPr>
+  </w:style>
+  <w:style w:type="paragraph" w:styleId="StandardWeb">
+    <w:name w:val="Normal (Web)"/>
+    <w:basedOn w:val="Standard"/>
+    <w:uiPriority w:val="99"/>
+    <w:semiHidden/>
+    <w:unhideWhenUsed/>
+    <w:rsid w:val="00AF517D"/>
+    <w:rPr>
+      <w:rFonts w:ascii="Times New Roman" w:hAnsi="Times New Roman" w:cs="Times New Roman"/>
     </w:rPr>
   </w:style>
 </w:styles>

</xml_diff>